<commit_message>
#260302 fix: fixed global settings
</commit_message>
<xml_diff>
--- a/files/fesih-ihtar.docx
+++ b/files/fesih-ihtar.docx
@@ -713,13 +713,6 @@
     </w:p>
     <w:p>
       <w:pPr>
-        <w:spacing w:before="80" w:after="80"/>
-        <w:ind w:left="720"/>
-        <w:jc w:val="both"/>
-      </w:pPr>
-    </w:p>
-    <w:p>
-      <w:pPr>
         <w:pStyle w:val="Normal2"/>
         <w:ind w:left="6372"/>
         <w:contextualSpacing/>
@@ -743,6 +736,66 @@
         <w:ind w:left="720"/>
         <w:jc w:val="both"/>
       </w:pPr>
+      <w:r>
+        <w:rPr>
+          <w:noProof/>
+        </w:rPr>
+        <w:drawing>
+          <wp:anchor distT="0" distB="0" distL="114300" distR="114300" simplePos="0" relativeHeight="251658240" behindDoc="0" locked="0" layoutInCell="1" allowOverlap="1" wp14:anchorId="591A39C6" wp14:editId="6AE915F3">
+            <wp:simplePos x="0" y="0"/>
+            <wp:positionH relativeFrom="column">
+              <wp:posOffset>4131310</wp:posOffset>
+            </wp:positionH>
+            <wp:positionV relativeFrom="paragraph">
+              <wp:posOffset>59690</wp:posOffset>
+            </wp:positionV>
+            <wp:extent cx="2040079" cy="723900"/>
+            <wp:effectExtent l="0" t="0" r="0" b="0"/>
+            <wp:wrapNone/>
+            <wp:docPr id="1276358603" name="Resim 1" descr="metin, yazı tipi, kılavuz içeren bir resim&#10;&#10;Yapay zeka tarafından oluşturulmuş içerik yanlış olabilir."/>
+            <wp:cNvGraphicFramePr>
+              <a:graphicFrameLocks xmlns:a="http://schemas.openxmlformats.org/drawingml/2006/main" noChangeAspect="1"/>
+            </wp:cNvGraphicFramePr>
+            <a:graphic xmlns:a="http://schemas.openxmlformats.org/drawingml/2006/main">
+              <a:graphicData uri="http://schemas.openxmlformats.org/drawingml/2006/picture">
+                <pic:pic xmlns:pic="http://schemas.openxmlformats.org/drawingml/2006/picture">
+                  <pic:nvPicPr>
+                    <pic:cNvPr id="1276358603" name="Resim 1" descr="metin, yazı tipi, kılavuz içeren bir resim&#10;&#10;Yapay zeka tarafından oluşturulmuş içerik yanlış olabilir."/>
+                    <pic:cNvPicPr/>
+                  </pic:nvPicPr>
+                  <pic:blipFill>
+                    <a:blip r:embed="rId8">
+                      <a:extLst>
+                        <a:ext uri="{28A0092B-C50C-407E-A947-70E740481C1C}">
+                          <a14:useLocalDpi xmlns:a14="http://schemas.microsoft.com/office/drawing/2010/main" val="0"/>
+                        </a:ext>
+                      </a:extLst>
+                    </a:blip>
+                    <a:stretch>
+                      <a:fillRect/>
+                    </a:stretch>
+                  </pic:blipFill>
+                  <pic:spPr>
+                    <a:xfrm>
+                      <a:off x="0" y="0"/>
+                      <a:ext cx="2040079" cy="723900"/>
+                    </a:xfrm>
+                    <a:prstGeom prst="rect">
+                      <a:avLst/>
+                    </a:prstGeom>
+                  </pic:spPr>
+                </pic:pic>
+              </a:graphicData>
+            </a:graphic>
+            <wp14:sizeRelH relativeFrom="page">
+              <wp14:pctWidth>0</wp14:pctWidth>
+            </wp14:sizeRelH>
+            <wp14:sizeRelV relativeFrom="page">
+              <wp14:pctHeight>0</wp14:pctHeight>
+            </wp14:sizeRelV>
+          </wp:anchor>
+        </w:drawing>
+      </w:r>
     </w:p>
     <w:p>
       <w:pPr>
@@ -769,6 +822,24 @@
           <w:bCs/>
         </w:rPr>
       </w:pPr>
+    </w:p>
+    <w:p>
+      <w:pPr>
+        <w:spacing w:before="80" w:after="80"/>
+        <w:jc w:val="both"/>
+        <w:rPr>
+          <w:bCs/>
+        </w:rPr>
+      </w:pPr>
+    </w:p>
+    <w:p>
+      <w:pPr>
+        <w:spacing w:before="80" w:after="80"/>
+        <w:jc w:val="both"/>
+        <w:rPr>
+          <w:bCs/>
+        </w:rPr>
+      </w:pPr>
       <w:r>
         <w:rPr>
           <w:bCs/>
@@ -784,8 +855,8 @@
       </w:pPr>
     </w:p>
     <w:sectPr>
-      <w:headerReference w:type="default" r:id="rId8"/>
-      <w:footerReference w:type="default" r:id="rId9"/>
+      <w:headerReference w:type="default" r:id="rId9"/>
+      <w:footerReference w:type="default" r:id="rId10"/>
       <w:pgSz w:w="11906" w:h="16838"/>
       <w:pgMar w:top="426" w:right="707" w:bottom="426" w:left="993" w:header="708" w:footer="708" w:gutter="0"/>
       <w:cols w:space="708"/>

</xml_diff>

<commit_message>
#260402 fix: fixed global settings
</commit_message>
<xml_diff>
--- a/files/fesih-ihtar.docx
+++ b/files/fesih-ihtar.docx
@@ -171,34 +171,32 @@
       </w:r>
     </w:p>
     <w:p>
+      <w:r>
+        <w:t>Sayın {{isim}} ({{</w:t>
+      </w:r>
+      <w:proofErr w:type="spellStart"/>
+      <w:r>
+        <w:t>tc_vkn_no</w:t>
+      </w:r>
+      <w:proofErr w:type="spellEnd"/>
+      <w:r>
+        <w:t>}})</w:t>
+      </w:r>
+    </w:p>
+    <w:p>
       <w:pPr>
         <w:pStyle w:val="Normal2"/>
-        <w:jc w:val="both"/>
-        <w:rPr>
-          <w:sz w:val="24"/>
-          <w:szCs w:val="24"/>
-        </w:rPr>
-      </w:pPr>
-      <w:r>
-        <w:rPr>
-          <w:sz w:val="24"/>
-          <w:szCs w:val="24"/>
-        </w:rPr>
-        <w:t>Sayın M</w:t>
-      </w:r>
-      <w:r>
-        <w:rPr>
-          <w:sz w:val="24"/>
-          <w:szCs w:val="24"/>
-        </w:rPr>
-        <w:t>üşterimiz</w:t>
-      </w:r>
-      <w:r>
-        <w:rPr>
-          <w:sz w:val="24"/>
-          <w:szCs w:val="24"/>
-        </w:rPr>
-        <w:t>;</w:t>
+        <w:rPr>
+          <w:sz w:val="24"/>
+          <w:szCs w:val="24"/>
+        </w:rPr>
+      </w:pPr>
+      <w:r>
+        <w:rPr>
+          <w:sz w:val="24"/>
+          <w:szCs w:val="24"/>
+        </w:rPr>
+        <w:t>{{adres}}</w:t>
       </w:r>
     </w:p>
     <w:p>

</xml_diff>